<commit_message>
updated & finalised for submission
</commit_message>
<xml_diff>
--- a/letter/letter.docx
+++ b/letter/letter.docx
@@ -215,7 +215,33 @@
         <w:t xml:space="preserve"> </w:t>
       </w:r>
       <w:r>
-        <w:t xml:space="preserve">countries behaved any differently from developed and emerging countries. The presented inference is therefore not only statistically unsupported, but is also misleading. A reasonable inference here is that there is no evidence of an impact of economic class, but that the</w:t>
+        <w:t xml:space="preserve">countries behaved any differently from developed and emerging countries. The presented inference is therefore not only statistically unsupported, but also misleading. A reasonable inference here is that there is no evidence of an impact of economic class (an important point to emphasise, despite the misleading</w:t>
+      </w:r>
+      <w:r>
+        <w:t xml:space="preserve"> </w:t>
+      </w:r>
+      <w:r>
+        <w:t xml:space="preserve">“significant”</w:t>
+      </w:r>
+      <w:r>
+        <w:t xml:space="preserve"> </w:t>
+      </w:r>
+      <w:r>
+        <w:t xml:space="preserve">p-value; also see</w:t>
+      </w:r>
+      <w:r>
+        <w:t xml:space="preserve"> </w:t>
+      </w:r>
+      <w:hyperlink w:anchor="sec-rigour">
+        <w:r>
+          <w:rPr>
+            <w:rStyle w:val="Hyperlink"/>
+          </w:rPr>
+          <w:t xml:space="preserve">Section 4</w:t>
+        </w:r>
+      </w:hyperlink>
+      <w:r>
+        <w:t xml:space="preserve">), but that the</w:t>
       </w:r>
       <w:r>
         <w:t xml:space="preserve"> </w:t>
@@ -227,7 +253,7 @@
         <w:t xml:space="preserve"> </w:t>
       </w:r>
       <w:r>
-        <w:t xml:space="preserve">countries behaved differently from the rest, likely due to other unaccounted differences.</w:t>
+        <w:t xml:space="preserve">countries behaved differently from all others, likely due to other unaccounted differences.</w:t>
       </w:r>
     </w:p>
     <w:p>
@@ -235,7 +261,7 @@
         <w:pStyle w:val="BodyText"/>
       </w:pPr>
       <w:r>
-        <w:t xml:space="preserve">A vital nuance that is lacking in both the analysis and its interpretation is the history of CS in countries, often independent of economic class. Many countries, developed and otherwise, have large networks of community scientists built over many years with the help of dedicated regional programmes (see https://ebird.org/about/portals/). Such countries likely responded in a complex manner to the pandemic, like those that in fact saw increases in data</w:t>
+        <w:t xml:space="preserve">A vital nuance that is lacking in both the analysis and its interpretation is the history of CS in countries, often independent of economic class. Many countries, developed and otherwise, have large networks of community scientists built over many years with the help of dedicated regional programmes (see https://ebird.org/about/portals/). Such countries likely responded in a complex manner to the pandemic, like those that in fact saw increases in data generation</w:t>
       </w:r>
       <w:r>
         <w:rPr>
@@ -286,7 +312,7 @@
         <w:t xml:space="preserve">6,7</w:t>
       </w:r>
       <w:r>
-        <w:t xml:space="preserve">. But without factoring in the presence of active resident birding communities and other sociocultural factors affecting CS participation, the discourse is reductionist and the question becomes trivial: how dependent are countries on foreign (primarily birding) tourists for data collection? If the tourist inflow stopped in such countries, there would obviously be an inevitable drop in data collection (see also</w:t>
+        <w:t xml:space="preserve">. But without factoring in the presence of active resident birding communities and other sociocultural factors affecting CS participation—which is admittedly difficult to achieve—the discourse is reductionist and the question becomes different altogether: how dependent are countries on foreign (primarily birding) tourists for data collection? If the tourist inflow stopped in such countries, there would obviously be an inevitable drop in data collection (see also</w:t>
       </w:r>
       <w:r>
         <w:t xml:space="preserve"> </w:t>
@@ -529,7 +555,28 @@
         </w:r>
       </w:hyperlink>
       <w:r>
-        <w:t xml:space="preserve">). Even in developed countries, these Mobility data were highly variable, suggesting that they must be treated with caution, but the authors instead reduced everything down to singular mean values for the entire six-week period.</w:t>
+        <w:t xml:space="preserve">). Even in developed countries, these Mobility data were highly variable, suggesting that they must be treated with caution, but the authors instead reduced everything down to singular mean values for the entire six-week period. For all these reasons, we argue that the</w:t>
+      </w:r>
+      <w:r>
+        <w:t xml:space="preserve"> </w:t>
+      </w:r>
+      <w:r>
+        <w:t xml:space="preserve">“change in park visits”</w:t>
+      </w:r>
+      <w:r>
+        <w:t xml:space="preserve"> </w:t>
+      </w:r>
+      <w:r>
+        <w:t xml:space="preserve">metric is not an appropriate measure of human mobility (despite the reported correlation with change in time spent at places of residence), especially in the context of the current study. Although these metrics were previously used as a crude heuristic in rapidly assessing immediate changes</w:t>
+      </w:r>
+      <w:r>
+        <w:rPr>
+          <w:vertAlign w:val="superscript"/>
+        </w:rPr>
+        <w:t xml:space="preserve">8</w:t>
+      </w:r>
+      <w:r>
+        <w:t xml:space="preserve">, basing the current global overarching analysis on them has serious consequences on interpretability of the results.</w:t>
       </w:r>
     </w:p>
     <w:bookmarkEnd w:id="27"/>
@@ -547,7 +594,7 @@
         <w:pStyle w:val="FirstParagraph"/>
       </w:pPr>
       <w:r>
-        <w:t xml:space="preserve">With their title, Roilo et al.</w:t>
+        <w:t xml:space="preserve">Roilo et al.</w:t>
       </w:r>
       <w:r>
         <w:rPr>
@@ -565,7 +612,7 @@
         <w:rPr>
           <w:vertAlign w:val="superscript"/>
         </w:rPr>
-        <w:t xml:space="preserve">8</w:t>
+        <w:t xml:space="preserve">9</w:t>
       </w:r>
       <w:r>
         <w:t xml:space="preserve">. Despite this, the authors restrict their study to just the first six weeks of the first lockdown (15 March–1 May 2020), which they call</w:t>
@@ -583,7 +630,7 @@
         <w:rPr>
           <w:vertAlign w:val="superscript"/>
         </w:rPr>
-        <w:t xml:space="preserve">9</w:t>
+        <w:t xml:space="preserve">10</w:t>
       </w:r>
       <w:r>
         <w:t xml:space="preserve">. For instance, the first lockdown in India started on 25 March 2020</w:t>
@@ -592,7 +639,7 @@
         <w:rPr>
           <w:vertAlign w:val="superscript"/>
         </w:rPr>
-        <w:t xml:space="preserve">10</w:t>
+        <w:t xml:space="preserve">11</w:t>
       </w:r>
       <w:r>
         <w:t xml:space="preserve"> </w:t>
@@ -604,7 +651,7 @@
         <w:rPr>
           <w:vertAlign w:val="superscript"/>
         </w:rPr>
-        <w:t xml:space="preserve">11</w:t>
+        <w:t xml:space="preserve">12</w:t>
       </w:r>
       <w:r>
         <w:t xml:space="preserve">, meaning the analysis misrepresents &gt;29% of the actual 2020 lockdown in India. In fact, the same analyses implemented just with broader temporal scope yields drastically different, sometimes contradictory results (</w:t>
@@ -632,7 +679,7 @@
         </w:r>
       </w:hyperlink>
       <w:r>
-        <w:t xml:space="preserve">). But the authors’ discussions lack the critical nuance of how narrow their scope actually is, and the title is therefore misleading at best. (Note: The interactive</w:t>
+        <w:t xml:space="preserve">; also see the authors’ interactive</w:t>
       </w:r>
       <w:r>
         <w:t xml:space="preserve"> </w:t>
@@ -646,10 +693,40 @@
         </w:r>
       </w:hyperlink>
       <w:r>
-        <w:t xml:space="preserve"> </w:t>
-      </w:r>
-      <w:r>
-        <w:t xml:space="preserve">allows full-year visualisation but not any actual analyses at the annual level.)</w:t>
+        <w:t xml:space="preserve">). But the authors’ interpretations and discussions lack the critical nuance of how narrow their scope actually is. The word</w:t>
+      </w:r>
+      <w:r>
+        <w:t xml:space="preserve"> </w:t>
+      </w:r>
+      <w:r>
+        <w:t xml:space="preserve">“pandemic”</w:t>
+      </w:r>
+      <w:r>
+        <w:t xml:space="preserve"> </w:t>
+      </w:r>
+      <w:r>
+        <w:t xml:space="preserve">appears 24 times in the text, and is often used interchangeably with</w:t>
+      </w:r>
+      <w:r>
+        <w:t xml:space="preserve"> </w:t>
+      </w:r>
+      <w:r>
+        <w:t xml:space="preserve">“first global lockdown”</w:t>
+      </w:r>
+      <w:r>
+        <w:t xml:space="preserve"> </w:t>
+      </w:r>
+      <w:r>
+        <w:t xml:space="preserve">throughout the manuscript (e.g.,</w:t>
+      </w:r>
+      <w:r>
+        <w:t xml:space="preserve"> </w:t>
+      </w:r>
+      <w:r>
+        <w:t xml:space="preserve">“The COVID-19 pandemic had a substantial impact on data collection efforts.”</w:t>
+      </w:r>
+      <w:r>
+        <w:t xml:space="preserve">). The interpretations therefore misleadingly present as a comprehensive overview of the pandemic, although the actual results are much more myopic.</w:t>
       </w:r>
     </w:p>
     <w:tbl>
@@ -857,7 +934,7 @@
         <w:rPr>
           <w:vertAlign w:val="superscript"/>
         </w:rPr>
-        <w:t xml:space="preserve">12,13</w:t>
+        <w:t xml:space="preserve">13,14</w:t>
       </w:r>
       <w:r>
         <w:t xml:space="preserve">, and rendering simple statistical methods and conventional significance tests inappropriate</w:t>
@@ -866,7 +943,7 @@
         <w:rPr>
           <w:vertAlign w:val="superscript"/>
         </w:rPr>
-        <w:t xml:space="preserve">14</w:t>
+        <w:t xml:space="preserve">15</w:t>
       </w:r>
       <w:r>
         <w:t xml:space="preserve">. Because this study includes several countries that have very little available CS data (most</w:t>
@@ -887,7 +964,7 @@
         <w:rPr>
           <w:vertAlign w:val="superscript"/>
         </w:rPr>
-        <w:t xml:space="preserve">12,13</w:t>
+        <w:t xml:space="preserve">13,14</w:t>
       </w:r>
       <w:r>
         <w:t xml:space="preserve"> </w:t>
@@ -899,7 +976,7 @@
         <w:rPr>
           <w:vertAlign w:val="superscript"/>
         </w:rPr>
-        <w:t xml:space="preserve">14</w:t>
+        <w:t xml:space="preserve">15</w:t>
       </w:r>
       <w:r>
         <w:t xml:space="preserve">.</w:t>
@@ -916,7 +993,7 @@
         <w:rPr>
           <w:vertAlign w:val="superscript"/>
         </w:rPr>
-        <w:t xml:space="preserve">15,16</w:t>
+        <w:t xml:space="preserve">16,17</w:t>
       </w:r>
       <w:r>
         <w:t xml:space="preserve">), or simple numerical or visual comparisons of percent change and counts. For example, their headline metric is a simple percent change in number of occurrence records (</w:t>
@@ -951,7 +1028,7 @@
         <w:rPr>
           <w:vertAlign w:val="superscript"/>
         </w:rPr>
-        <w:t xml:space="preserve">17,18</w:t>
+        <w:t xml:space="preserve">18,19</w:t>
       </w:r>
       <w:r>
         <w:t xml:space="preserve">.</w:t>
@@ -962,7 +1039,16 @@
         <w:pStyle w:val="BodyText"/>
       </w:pPr>
       <w:r>
-        <w:t xml:space="preserve">Another inappropriate statistical choice is to assess significance of the 2020 lockdown deviation in data collection, by comparing predicted values for 2020 (from a smooth-splined growth curve for 2010–2023) with the observed values. Despite the misleading reference in Table S2</w:t>
+        <w:t xml:space="preserve">Another inappropriate statistical choice is to assess significance of the 2020 lockdown deviation in data collection, by comparing predicted values for 2020 (from a smooth-splined growth curve for 2010–2023) with the observed values. Smoothing splines are not appropriate in this context due to their following properties</w:t>
+      </w:r>
+      <w:r>
+        <w:rPr>
+          <w:vertAlign w:val="superscript"/>
+        </w:rPr>
+        <w:t xml:space="preserve">20</w:t>
+      </w:r>
+      <w:r>
+        <w:t xml:space="preserve">: (1) The width of their confidence interval depends on the smoothing parameter, which the authors limited to 0.4–0.6 without justification. (2) They do not produce simultaneous confidence intervals, thereby underestimating uncertainty and risking false positives. (3) They ignore residual noise, rendering comparisons of observed and predicted values meaningless. We also found some unaddressed contradictions in these and similar results. Fig. 1</w:t>
       </w:r>
       <w:r>
         <w:rPr>
@@ -974,25 +1060,7 @@
         <w:t xml:space="preserve"> </w:t>
       </w:r>
       <w:r>
-        <w:t xml:space="preserve">to</w:t>
-      </w:r>
-      <w:r>
-        <w:t xml:space="preserve"> </w:t>
-      </w:r>
-      <w:r>
-        <w:t xml:space="preserve">“linear regressions”</w:t>
-      </w:r>
-      <w:r>
-        <w:t xml:space="preserve">, smoothing splines are not appropriate in this context due to their following properties</w:t>
-      </w:r>
-      <w:r>
-        <w:rPr>
-          <w:vertAlign w:val="superscript"/>
-        </w:rPr>
-        <w:t xml:space="preserve">19</w:t>
-      </w:r>
-      <w:r>
-        <w:t xml:space="preserve">: (1) The width of their confidence interval depends on the smoothing parameter, which the authors limited to 0.4–0.6 without justification. (2) They do not produce simultaneous confidence intervals, thereby underestimating uncertainty and risking false positives. (3) They ignore residual noise, rendering comparisons of observed and predicted values meaningless. We also found some unaddressed contradictions in these and similar results. Fig. 1</w:t>
+        <w:t xml:space="preserve">shows percent change between 2019 and 2020, whereas Table S2</w:t>
       </w:r>
       <w:r>
         <w:rPr>
@@ -1004,7 +1072,15 @@
         <w:t xml:space="preserve"> </w:t>
       </w:r>
       <w:r>
-        <w:t xml:space="preserve">shows percent change between 2019 and 2020, whereas Table S2</w:t>
+        <w:t xml:space="preserve">shows percent change between predicted and observed values for 2020—and these two have several contradictory patterns. For example, Canada, the United States, New Zealand, Zimbabwe and Papua New Guinea all show non-significant changes in Table S2 but decreases (Papua New Guinea) or increases (others) in Fig. 1. Further, Australia shows a decrease in Table S2 but an increase in Fig. 1.</w:t>
+      </w:r>
+    </w:p>
+    <w:p>
+      <w:pPr>
+        <w:pStyle w:val="BodyText"/>
+      </w:pPr>
+      <w:r>
+        <w:t xml:space="preserve">The authors found that eBirders covered smaller areas than expected during the first COVID-19 lockdown (Fig. 3 in ref.</w:t>
       </w:r>
       <w:r>
         <w:rPr>
@@ -1013,10 +1089,97 @@
         <w:t xml:space="preserve">1</w:t>
       </w:r>
       <w:r>
-        <w:t xml:space="preserve"> </w:t>
-      </w:r>
-      <w:r>
-        <w:t xml:space="preserve">shows percent change between predicted and observed values for 2020—and these two have several contradictory patterns. For example, Canada, the United States, New Zealand, Zimbabwe and Papua New Guinea all show non-significant changes in Table S2 but decreases (Papua New Guinea) or increases (others) in Fig. 1. Further, Australia shows a decrease in Table S2 but an increase in Fig. 1.</w:t>
+        <w:t xml:space="preserve">). While this is one of few unanimous, consistent patterns across studies exploring the pandemic impact</w:t>
+      </w:r>
+      <w:r>
+        <w:rPr>
+          <w:vertAlign w:val="superscript"/>
+        </w:rPr>
+        <w:t xml:space="preserve">2–4,21,22</w:t>
+      </w:r>
+      <w:r>
+        <w:t xml:space="preserve">, the statistical method used to arrive at the result is inappropriate. They used a two-sample Kolmogorov-Smirnov test to check for a significant difference between the 2019 and 2020 values, but this test focuses on the distribution of data (rather than their means as in previous analyses)—effectively comparing whether areas of eBirder activity in 2019 and 2020 followed the same statistical distribution</w:t>
+      </w:r>
+      <w:r>
+        <w:rPr>
+          <w:vertAlign w:val="superscript"/>
+        </w:rPr>
+        <w:t xml:space="preserve">23</w:t>
+      </w:r>
+      <w:r>
+        <w:t xml:space="preserve">. This test is thus sensitive to differences in shape in addition to mean or variance, and is therefore not robust to unequal sample sizes or noisy data</w:t>
+      </w:r>
+      <w:r>
+        <w:rPr>
+          <w:vertAlign w:val="superscript"/>
+        </w:rPr>
+        <w:t xml:space="preserve">24</w:t>
+      </w:r>
+      <w:r>
+        <w:t xml:space="preserve">. For instance, it would detect a</w:t>
+      </w:r>
+      <w:r>
+        <w:t xml:space="preserve"> </w:t>
+      </w:r>
+      <w:r>
+        <w:t xml:space="preserve">“significant”</w:t>
+      </w:r>
+      <w:r>
+        <w:t xml:space="preserve"> </w:t>
+      </w:r>
+      <w:r>
+        <w:t xml:space="preserve">difference if just birders covering the largest areas (outliers) increased or decreased their area of activity, even if the overall mean value remained similar.</w:t>
+      </w:r>
+    </w:p>
+    <w:bookmarkEnd w:id="38"/>
+    <w:bookmarkStart w:id="39" w:name="X158f8870fd7eeb125c2f1952e2bd396a7271cb3"/>
+    <w:p>
+      <w:pPr>
+        <w:pStyle w:val="Heading1"/>
+      </w:pPr>
+      <w:r>
+        <w:t xml:space="preserve">5. Number of records is a flawed indicator of effort</w:t>
+      </w:r>
+    </w:p>
+    <w:p>
+      <w:pPr>
+        <w:pStyle w:val="FirstParagraph"/>
+      </w:pPr>
+      <w:r>
+        <w:t xml:space="preserve">The variable of interest in this study is biodiversity monitoring effort, for which the authors used the total number of records uploaded to GBIF and eBird (=</w:t>
+      </w:r>
+      <w:r>
+        <w:t xml:space="preserve"> </w:t>
+      </w:r>
+      <w:r>
+        <w:t xml:space="preserve">“observations”</w:t>
+      </w:r>
+      <w:r>
+        <w:t xml:space="preserve">) as proxies (in the</w:t>
+      </w:r>
+      <w:r>
+        <w:t xml:space="preserve"> </w:t>
+      </w:r>
+      <w:r>
+        <w:t xml:space="preserve">“biodiversity data collection”</w:t>
+      </w:r>
+      <w:r>
+        <w:t xml:space="preserve"> </w:t>
+      </w:r>
+      <w:r>
+        <w:t xml:space="preserve">and</w:t>
+      </w:r>
+      <w:r>
+        <w:t xml:space="preserve"> </w:t>
+      </w:r>
+      <w:r>
+        <w:t xml:space="preserve">“birders’ numbers and activity”</w:t>
+      </w:r>
+      <w:r>
+        <w:t xml:space="preserve"> </w:t>
+      </w:r>
+      <w:r>
+        <w:t xml:space="preserve">sections respectively). We argue that the number of records is not an appropriate proxy for biodiversity monitoring effort, so this choice of variable is a fundamental flaw of the analyses and their interpretations.</w:t>
       </w:r>
     </w:p>
     <w:p>
@@ -1024,7 +1187,145 @@
         <w:pStyle w:val="BodyText"/>
       </w:pPr>
       <w:r>
-        <w:t xml:space="preserve">The authors found that eBirders covered smaller areas than expected during the first COVID-19 lockdown (Fig. 3 in ref.</w:t>
+        <w:t xml:space="preserve">eBird is the primary source in GBIF data (contributing 68% of</w:t>
+      </w:r>
+      <w:r>
+        <w:t xml:space="preserve"> </w:t>
+      </w:r>
+      <w:r>
+        <w:t xml:space="preserve">“human”</w:t>
+      </w:r>
+      <w:r>
+        <w:t xml:space="preserve"> </w:t>
+      </w:r>
+      <w:r>
+        <w:t xml:space="preserve">observations in the full dataset, and 76% in the lockdown data analysed here), and eBird data were not removed for the GBIF analysis. eBird follows a semi-structured framework, with data organised at the level of checklists and not as individual observations</w:t>
+      </w:r>
+      <w:r>
+        <w:rPr>
+          <w:vertAlign w:val="superscript"/>
+        </w:rPr>
+        <w:t xml:space="preserve">25,26</w:t>
+      </w:r>
+      <w:r>
+        <w:t xml:space="preserve">. Further, all checklists are not created equal:</w:t>
+      </w:r>
+      <w:r>
+        <w:t xml:space="preserve"> </w:t>
+      </w:r>
+      <w:r>
+        <w:t xml:space="preserve">“complete”</w:t>
+      </w:r>
+      <w:r>
+        <w:t xml:space="preserve"> </w:t>
+      </w:r>
+      <w:r>
+        <w:t xml:space="preserve">checklists are the gold standard indicators of data generation effort, whereas</w:t>
+      </w:r>
+      <w:r>
+        <w:t xml:space="preserve"> </w:t>
+      </w:r>
+      <w:r>
+        <w:t xml:space="preserve">“incomplete”</w:t>
+      </w:r>
+      <w:r>
+        <w:t xml:space="preserve"> </w:t>
+      </w:r>
+      <w:r>
+        <w:t xml:space="preserve">checklists show much more variability and a much weaker relationship with effort. An appropriate indication of data generation is therefore the number of (complete) checklists rather than the number of observations. Aside from the eBird data in the analysis not having been curated for complete checklists, several pandemic-associated changes (as well as many unrelated factors) are likely to have influenced the number of observations per checklist, two of which we discuss as especially important below.</w:t>
+      </w:r>
+    </w:p>
+    <w:p>
+      <w:pPr>
+        <w:numPr>
+          <w:ilvl w:val="0"/>
+          <w:numId w:val="1001"/>
+        </w:numPr>
+      </w:pPr>
+      <w:r>
+        <w:rPr>
+          <w:b/>
+          <w:bCs/>
+        </w:rPr>
+        <w:t xml:space="preserve">Reduced mobility.</w:t>
+      </w:r>
+      <w:r>
+        <w:t xml:space="preserve"> </w:t>
+      </w:r>
+      <w:r>
+        <w:t xml:space="preserve">People moved around less during the pandemic and also potentially visited fewer national parks and</w:t>
+      </w:r>
+      <w:r>
+        <w:t xml:space="preserve"> </w:t>
+      </w:r>
+      <w:r>
+        <w:t xml:space="preserve">“interesting”</w:t>
+      </w:r>
+      <w:r>
+        <w:t xml:space="preserve"> </w:t>
+      </w:r>
+      <w:r>
+        <w:t xml:space="preserve">areas, instead spending more time in urban areas closer to home</w:t>
+      </w:r>
+      <w:r>
+        <w:rPr>
+          <w:vertAlign w:val="superscript"/>
+        </w:rPr>
+        <w:t xml:space="preserve">2–4,21,22</w:t>
+      </w:r>
+      <w:r>
+        <w:t xml:space="preserve">. This very likely resulted in a reduction in the number of species observed per checklist due to lower species diversity in urban areas. Therefore, even if the number of checklists (i.e., data generation effort) did not change during the pandemic, the number of observations will inherently have decreased, creating the false impression of lowered participation in CS.</w:t>
+      </w:r>
+    </w:p>
+    <w:p>
+      <w:pPr>
+        <w:numPr>
+          <w:ilvl w:val="0"/>
+          <w:numId w:val="1001"/>
+        </w:numPr>
+      </w:pPr>
+      <w:r>
+        <w:rPr>
+          <w:b/>
+          <w:bCs/>
+        </w:rPr>
+        <w:t xml:space="preserve">Reduced group birding.</w:t>
+      </w:r>
+      <w:r>
+        <w:t xml:space="preserve"> </w:t>
+      </w:r>
+      <w:r>
+        <w:t xml:space="preserve">People also avoided groups during the lockdowns</w:t>
+      </w:r>
+      <w:r>
+        <w:rPr>
+          <w:vertAlign w:val="superscript"/>
+        </w:rPr>
+        <w:t xml:space="preserve">3,21</w:t>
+      </w:r>
+      <w:r>
+        <w:t xml:space="preserve">, which likely reflected in eBird data as fewer</w:t>
+      </w:r>
+      <w:r>
+        <w:t xml:space="preserve"> </w:t>
+      </w:r>
+      <w:r>
+        <w:t xml:space="preserve">“group birding”</w:t>
+      </w:r>
+      <w:r>
+        <w:t xml:space="preserve"> </w:t>
+      </w:r>
+      <w:r>
+        <w:t xml:space="preserve">events</w:t>
+      </w:r>
+      <w:r>
+        <w:rPr>
+          <w:vertAlign w:val="superscript"/>
+        </w:rPr>
+        <w:t xml:space="preserve">3</w:t>
+      </w:r>
+      <w:r>
+        <w:t xml:space="preserve">. Roilo et al.</w:t>
       </w:r>
       <w:r>
         <w:rPr>
@@ -1033,149 +1334,22 @@
         <w:t xml:space="preserve">1</w:t>
       </w:r>
       <w:r>
-        <w:t xml:space="preserve">). While this is one of few unanimous, consistent patterns across studies exploring the pandemic impact</w:t>
-      </w:r>
-      <w:r>
-        <w:rPr>
-          <w:vertAlign w:val="superscript"/>
-        </w:rPr>
-        <w:t xml:space="preserve">2–4,20,21</w:t>
-      </w:r>
-      <w:r>
-        <w:t xml:space="preserve">, the statistical method used to arrive at the result is inappropriate. They used a two-sample Kolmogorov-Smirnov test to check for a significant difference between the 2019 and 2020 values, but this test focuses on the distribution of data (rather than their means as in previous analyses)—effectively comparing whether areas of eBirder activity in 2019 and 2020 followed the same distribution</w:t>
-      </w:r>
-      <w:r>
-        <w:rPr>
-          <w:vertAlign w:val="superscript"/>
-        </w:rPr>
-        <w:t xml:space="preserve">22</w:t>
-      </w:r>
-      <w:r>
-        <w:t xml:space="preserve">. This test is thus sensitive to differences in shape in addition to mean or variance, and is therefore not robust to unequal sample sizes or noisy data</w:t>
-      </w:r>
-      <w:r>
-        <w:rPr>
-          <w:vertAlign w:val="superscript"/>
-        </w:rPr>
-        <w:t xml:space="preserve">23</w:t>
-      </w:r>
-      <w:r>
-        <w:t xml:space="preserve">. For instance, it would detect a</w:t>
-      </w:r>
-      <w:r>
-        <w:t xml:space="preserve"> </w:t>
-      </w:r>
-      <w:r>
-        <w:t xml:space="preserve">“significant”</w:t>
-      </w:r>
-      <w:r>
-        <w:t xml:space="preserve"> </w:t>
-      </w:r>
-      <w:r>
-        <w:t xml:space="preserve">difference if just birders covering the largest areas (outliers) increased or decreased their area of activity, even if the overall mean value remained similar.</w:t>
-      </w:r>
-    </w:p>
-    <w:bookmarkEnd w:id="38"/>
-    <w:bookmarkStart w:id="39" w:name="Xab8c2b9afa31c5c50e46453c3c1f734608bd615"/>
-    <w:p>
-      <w:pPr>
-        <w:pStyle w:val="Heading1"/>
-      </w:pPr>
-      <w:r>
-        <w:t xml:space="preserve">5. Change in number of eBird records is a flawed response variable</w:t>
-      </w:r>
-    </w:p>
-    <w:p>
-      <w:pPr>
-        <w:pStyle w:val="FirstParagraph"/>
-      </w:pPr>
-      <w:r>
-        <w:t xml:space="preserve">The main response variable in this analysis is the total number of records uploaded to eBird (=</w:t>
-      </w:r>
-      <w:r>
-        <w:t xml:space="preserve"> </w:t>
-      </w:r>
-      <w:r>
-        <w:t xml:space="preserve">“observations”</w:t>
-      </w:r>
-      <w:r>
-        <w:t xml:space="preserve">) and GBIF—where eBird is the primary source, contributing 68% of</w:t>
-      </w:r>
-      <w:r>
-        <w:t xml:space="preserve"> </w:t>
-      </w:r>
-      <w:r>
-        <w:t xml:space="preserve">“human”</w:t>
-      </w:r>
-      <w:r>
-        <w:t xml:space="preserve"> </w:t>
-      </w:r>
-      <w:r>
-        <w:t xml:space="preserve">observations in the full dataset, and 76% in the lockdown data analysed here. Given that eBird data were not removed for the GBIF analysis, we argue that this choice of variable is a fundamental flaw of the analysis, and hence also of much of the interpretation (Fig. 3 and Fig. 4 in ref.</w:t>
-      </w:r>
-      <w:r>
-        <w:rPr>
-          <w:vertAlign w:val="superscript"/>
-        </w:rPr>
-        <w:t xml:space="preserve">1</w:t>
-      </w:r>
-      <w:r>
-        <w:t xml:space="preserve">; see also</w:t>
-      </w:r>
-      <w:r>
-        <w:t xml:space="preserve"> </w:t>
-      </w:r>
-      <w:hyperlink w:anchor="sec-act-ranges">
-        <w:r>
-          <w:rPr>
-            <w:rStyle w:val="Hyperlink"/>
-          </w:rPr>
-          <w:t xml:space="preserve">Section 6</w:t>
-        </w:r>
-      </w:hyperlink>
-      <w:r>
-        <w:t xml:space="preserve">).</w:t>
-      </w:r>
-    </w:p>
-    <w:p>
-      <w:pPr>
-        <w:pStyle w:val="BodyText"/>
-      </w:pPr>
-      <w:r>
-        <w:t xml:space="preserve">eBird follows a semi-structured framework</w:t>
-      </w:r>
-      <w:r>
-        <w:rPr>
-          <w:vertAlign w:val="superscript"/>
-        </w:rPr>
-        <w:t xml:space="preserve">24,25</w:t>
-      </w:r>
-      <w:r>
-        <w:t xml:space="preserve">, with data organised at the level of checklists and not as individual observations. Further, all checklists are not created equal:</w:t>
-      </w:r>
-      <w:r>
-        <w:t xml:space="preserve"> </w:t>
-      </w:r>
-      <w:r>
-        <w:t xml:space="preserve">“complete”</w:t>
-      </w:r>
-      <w:r>
-        <w:t xml:space="preserve"> </w:t>
-      </w:r>
-      <w:r>
-        <w:t xml:space="preserve">checklists are the gold standard indicators of data generation effort, whereas</w:t>
-      </w:r>
-      <w:r>
-        <w:t xml:space="preserve"> </w:t>
-      </w:r>
-      <w:r>
-        <w:t xml:space="preserve">“incomplete”</w:t>
-      </w:r>
-      <w:r>
-        <w:t xml:space="preserve"> </w:t>
-      </w:r>
-      <w:r>
-        <w:t xml:space="preserve">checklists show much more variability and a much weaker relationship with effort. An appropriate indication of data generation is therefore the number of (complete) checklists rather than the number of observations. Aside from the eBird data not having been curated for complete checklists (see</w:t>
+        <w:t xml:space="preserve"> </w:t>
+      </w:r>
+      <w:r>
+        <w:t xml:space="preserve">summarised observations without removing</w:t>
+      </w:r>
+      <w:r>
+        <w:t xml:space="preserve"> </w:t>
+      </w:r>
+      <w:r>
+        <w:t xml:space="preserve">“duplicates”</w:t>
+      </w:r>
+      <w:r>
+        <w:t xml:space="preserve"> </w:t>
+      </w:r>
+      <w:r>
+        <w:t xml:space="preserve">(another obvious data curation step that was missed;</w:t>
       </w:r>
       <w:r>
         <w:t xml:space="preserve"> </w:t>
@@ -1189,100 +1363,109 @@
         </w:r>
       </w:hyperlink>
       <w:r>
-        <w:t xml:space="preserve">), several pandemic-associated changes (as well as many unrelated factors) are likely to have influenced the number of observations per checklist, two of which we discuss as especially important below.</w:t>
-      </w:r>
-    </w:p>
-    <w:p>
-      <w:pPr>
-        <w:numPr>
-          <w:ilvl w:val="0"/>
-          <w:numId w:val="1001"/>
-        </w:numPr>
-      </w:pPr>
-      <w:r>
-        <w:rPr>
-          <w:b/>
-          <w:bCs/>
-        </w:rPr>
-        <w:t xml:space="preserve">Reduced mobility.</w:t>
-      </w:r>
-      <w:r>
-        <w:t xml:space="preserve"> </w:t>
-      </w:r>
-      <w:r>
-        <w:t xml:space="preserve">People moved around less during the pandemic and also potentially visited fewer national parks and</w:t>
-      </w:r>
-      <w:r>
-        <w:t xml:space="preserve"> </w:t>
-      </w:r>
-      <w:r>
-        <w:t xml:space="preserve">“interesting”</w:t>
-      </w:r>
-      <w:r>
-        <w:t xml:space="preserve"> </w:t>
-      </w:r>
-      <w:r>
-        <w:t xml:space="preserve">areas, instead spending more time in urban areas closer to home</w:t>
-      </w:r>
-      <w:r>
-        <w:rPr>
-          <w:vertAlign w:val="superscript"/>
-        </w:rPr>
-        <w:t xml:space="preserve">2–4,20,21</w:t>
-      </w:r>
-      <w:r>
-        <w:t xml:space="preserve">. This very likely resulted in a reduction in the number of species observed per checklist due to lower species diversity in urban areas. Therefore, even if the number of checklists (i.e., data generation effort) did not change during the pandemic, the number of observations will inherently have decreased, creating the false impression of lowered participation in CS.</w:t>
-      </w:r>
-    </w:p>
-    <w:p>
-      <w:pPr>
-        <w:numPr>
-          <w:ilvl w:val="0"/>
-          <w:numId w:val="1001"/>
-        </w:numPr>
-      </w:pPr>
-      <w:r>
-        <w:rPr>
-          <w:b/>
-          <w:bCs/>
-        </w:rPr>
-        <w:t xml:space="preserve">Reduced group birding.</w:t>
-      </w:r>
-      <w:r>
-        <w:t xml:space="preserve"> </w:t>
-      </w:r>
-      <w:r>
-        <w:t xml:space="preserve">People also avoided groups during the lockdowns</w:t>
-      </w:r>
-      <w:r>
-        <w:rPr>
-          <w:vertAlign w:val="superscript"/>
-        </w:rPr>
-        <w:t xml:space="preserve">3,20</w:t>
-      </w:r>
-      <w:r>
-        <w:t xml:space="preserve">, which likely reflected in eBird data as fewer</w:t>
-      </w:r>
-      <w:r>
-        <w:t xml:space="preserve"> </w:t>
-      </w:r>
-      <w:r>
-        <w:t xml:space="preserve">“group birding”</w:t>
-      </w:r>
-      <w:r>
-        <w:t xml:space="preserve"> </w:t>
-      </w:r>
-      <w:r>
-        <w:t xml:space="preserve">events</w:t>
-      </w:r>
-      <w:r>
-        <w:rPr>
-          <w:vertAlign w:val="superscript"/>
-        </w:rPr>
-        <w:t xml:space="preserve">3</w:t>
-      </w:r>
-      <w:r>
-        <w:t xml:space="preserve">. Roilo et al.</w:t>
+        <w:t xml:space="preserve">), which are multiple copies of the same observations created for every eBirder involved in a group birding event. Birding in groups typically also increases species detection rates, so irrespective of how the number of</w:t>
+      </w:r>
+      <w:r>
+        <w:t xml:space="preserve"> </w:t>
+      </w:r>
+      <w:r>
+        <w:t xml:space="preserve">“unique”</w:t>
+      </w:r>
+      <w:r>
+        <w:t xml:space="preserve"> </w:t>
+      </w:r>
+      <w:r>
+        <w:t xml:space="preserve">checklists (i.e., independent birding effort) changed, the number of observations during 2020 likely decreased.</w:t>
+      </w:r>
+    </w:p>
+    <w:p>
+      <w:pPr>
+        <w:pStyle w:val="FirstParagraph"/>
+      </w:pPr>
+      <w:r>
+        <w:t xml:space="preserve">The number of non-eBird GBIF records shows an even weaker correspondence with biodiversity monitoring effort, as they arise from much more variable and heterogeneous data generation processes. Moreover, even though quantifying such effort is possible with the eBird Basic Dataset (EBD), this is difficult to achieve using the GBIF dataset, which only contains the stripped down eBird Observational Dataset (EOD; see ref.</w:t>
+      </w:r>
+      <w:r>
+        <w:rPr>
+          <w:vertAlign w:val="superscript"/>
+        </w:rPr>
+        <w:t xml:space="preserve">27</w:t>
+      </w:r>
+      <w:r>
+        <w:t xml:space="preserve">), missing several crucial parameters such as the group birding identifier. This highlights that the GBIF dataset is currently limited in scope to biodiversity occurrence information and is inappropriate for broader applications relating to the data generation process like sociocultural analyses. We hope that with the ongoing efforts to better integrate survey data into GBIF in their full configurations</w:t>
+      </w:r>
+      <w:r>
+        <w:rPr>
+          <w:vertAlign w:val="superscript"/>
+        </w:rPr>
+        <w:t xml:space="preserve">28</w:t>
+      </w:r>
+      <w:r>
+        <w:t xml:space="preserve">, biodiversity studies using GBIF may soon be able to sidestep the issues arising from incomplete data projection.</w:t>
+      </w:r>
+    </w:p>
+    <w:bookmarkEnd w:id="39"/>
+    <w:bookmarkStart w:id="40" w:name="sec-act-ranges"/>
+    <w:p>
+      <w:pPr>
+        <w:pStyle w:val="Heading1"/>
+      </w:pPr>
+      <w:r>
+        <w:t xml:space="preserve">6. Analysis of top eBirder activity is uninformative</w:t>
+      </w:r>
+    </w:p>
+    <w:p>
+      <w:pPr>
+        <w:pStyle w:val="FirstParagraph"/>
+      </w:pPr>
+      <w:r>
+        <w:t xml:space="preserve">The authors compared the countries where each eBirder recorded observations in 2019 and 2020. However, they only considered 30 eBirders per country for this analysis, and these 30 were selected from the eBirders with observations on the most days during the six-week period in 2019—which firstly is not equivalent to contributing most data. They introduce the premise of transboundary migrations of eBirders, suggesting that in less developed countries (which are generally also more biodiverse) higher proportions of data contribution come from tourists, i.e., foreign eBirders. While this is undeniably true for regions without resident eBirding communities (see</w:t>
+      </w:r>
+      <w:r>
+        <w:t xml:space="preserve"> </w:t>
+      </w:r>
+      <w:hyperlink w:anchor="sec-socioeconomic">
+        <w:r>
+          <w:rPr>
+            <w:rStyle w:val="Hyperlink"/>
+          </w:rPr>
+          <w:t xml:space="preserve">Section 2</w:t>
+        </w:r>
+      </w:hyperlink>
+      <w:r>
+        <w:t xml:space="preserve">), the analysis itself is questionable because it considers the 2019 top 30 eBirder list as the benchmark. This is misleading especially for such short timeframes, since many factors unrelated to the pandemic or the economic class of a country could result in a top 30 list that does not represent local consistent birding. In other words, short-term visitors or tourists may lead in</w:t>
+      </w:r>
+      <w:r>
+        <w:t xml:space="preserve"> </w:t>
+      </w:r>
+      <w:r>
+        <w:t xml:space="preserve">“most activity”</w:t>
+      </w:r>
+      <w:r>
+        <w:t xml:space="preserve"> </w:t>
+      </w:r>
+      <w:r>
+        <w:t xml:space="preserve">for a given six-week period, even while many resident birders continue to contribute regularly but remain underrepresented.</w:t>
+      </w:r>
+    </w:p>
+    <w:p>
+      <w:pPr>
+        <w:pStyle w:val="BodyText"/>
+      </w:pPr>
+      <w:r>
+        <w:t xml:space="preserve">It is obvious and intuitive that countries without resident eBirding communities would have greater tourist contribution. For these countries, the authors’ concept of top 30</w:t>
+      </w:r>
+      <w:r>
+        <w:t xml:space="preserve"> </w:t>
+      </w:r>
+      <w:r>
+        <w:t xml:space="preserve">“returning birders”</w:t>
+      </w:r>
+      <w:r>
+        <w:t xml:space="preserve"> </w:t>
+      </w:r>
+      <w:r>
+        <w:t xml:space="preserve">breaks down since non-residents would dominate the top 30 list and most tourists would not return to the same country in the following year. Moreover, the authors interpret Fig. 4</w:t>
       </w:r>
       <w:r>
         <w:rPr>
@@ -1294,22 +1477,7 @@
         <w:t xml:space="preserve"> </w:t>
       </w:r>
       <w:r>
-        <w:t xml:space="preserve">summarised observations without removing</w:t>
-      </w:r>
-      <w:r>
-        <w:t xml:space="preserve"> </w:t>
-      </w:r>
-      <w:r>
-        <w:t xml:space="preserve">“duplicates”</w:t>
-      </w:r>
-      <w:r>
-        <w:t xml:space="preserve"> </w:t>
-      </w:r>
-      <w:r>
-        <w:t xml:space="preserve">(another obvious data curation step that was missed;</w:t>
-      </w:r>
-      <w:r>
-        <w:t xml:space="preserve"> </w:t>
+        <w:t xml:space="preserve">with statements about developing and least developed countries together; the actual results only hold true for the least developed countries, whereas developing countries, notably, showed patterns similar to emerging and developed countries. This reiterates the importance of threshold minima for data quantity (</w:t>
       </w:r>
       <w:hyperlink w:anchor="sec-rigour">
         <w:r>
@@ -1320,105 +1488,6 @@
         </w:r>
       </w:hyperlink>
       <w:r>
-        <w:t xml:space="preserve">), which are multiple copies of the same observations created for every eBirder involved in a group birding event. Birding in groups typically also increases species detection rates, so irrespective of how the number of</w:t>
-      </w:r>
-      <w:r>
-        <w:t xml:space="preserve"> </w:t>
-      </w:r>
-      <w:r>
-        <w:t xml:space="preserve">“unique”</w:t>
-      </w:r>
-      <w:r>
-        <w:t xml:space="preserve"> </w:t>
-      </w:r>
-      <w:r>
-        <w:t xml:space="preserve">checklists (i.e., independent birding effort) changed, the number of observations during 2020 likely decreased.</w:t>
-      </w:r>
-    </w:p>
-    <w:bookmarkEnd w:id="39"/>
-    <w:bookmarkStart w:id="40" w:name="sec-act-ranges"/>
-    <w:p>
-      <w:pPr>
-        <w:pStyle w:val="Heading1"/>
-      </w:pPr>
-      <w:r>
-        <w:t xml:space="preserve">6. Analysis of top eBirder activity is uninformative</w:t>
-      </w:r>
-    </w:p>
-    <w:p>
-      <w:pPr>
-        <w:pStyle w:val="FirstParagraph"/>
-      </w:pPr>
-      <w:r>
-        <w:t xml:space="preserve">The authors compared the countries where each eBirder recorded observations in 2019 and 2020. However, they only considered 30 eBirders per country for this analysis, and these 30 were selected from the eBirders with observations on the most days during the six-week period in 2019. They introduce the premise of transboundary migrations of eBirders, suggesting that in less developed countries (which are generally also more biodiverse) higher proportions of data contribution come from tourists, i.e., foreign eBirders. While this is undeniably true for regions without resident eBirding communities (see</w:t>
-      </w:r>
-      <w:r>
-        <w:t xml:space="preserve"> </w:t>
-      </w:r>
-      <w:hyperlink w:anchor="sec-socioeconomic">
-        <w:r>
-          <w:rPr>
-            <w:rStyle w:val="Hyperlink"/>
-          </w:rPr>
-          <w:t xml:space="preserve">Section 2</w:t>
-        </w:r>
-      </w:hyperlink>
-      <w:r>
-        <w:t xml:space="preserve">), the analysis itself is questionable because it considers the 2019 top 30 eBirder list as the benchmark. This is misleading especially for such short timeframes, since many factors unrelated to the pandemic or the economic class of a country could result in a top 30 list that does not represent local consistent birding. In other words, short-term visitors or tourists may lead in</w:t>
-      </w:r>
-      <w:r>
-        <w:t xml:space="preserve"> </w:t>
-      </w:r>
-      <w:r>
-        <w:t xml:space="preserve">“most activity”</w:t>
-      </w:r>
-      <w:r>
-        <w:t xml:space="preserve"> </w:t>
-      </w:r>
-      <w:r>
-        <w:t xml:space="preserve">for a given six-week period, even while many resident birders continue to contribute regularly but remain underrepresented.</w:t>
-      </w:r>
-    </w:p>
-    <w:p>
-      <w:pPr>
-        <w:pStyle w:val="BodyText"/>
-      </w:pPr>
-      <w:r>
-        <w:t xml:space="preserve">It is obvious and intuitive that countries without resident eBirding communities would have greater tourist contribution. The authors’ concept of top 30</w:t>
-      </w:r>
-      <w:r>
-        <w:t xml:space="preserve"> </w:t>
-      </w:r>
-      <w:r>
-        <w:t xml:space="preserve">“returning birders”</w:t>
-      </w:r>
-      <w:r>
-        <w:t xml:space="preserve"> </w:t>
-      </w:r>
-      <w:r>
-        <w:t xml:space="preserve">does not make sense in the context of how tourism typically functions—most tourists would not return to the same country in the following year. Moreover, the authors interpret Fig. 4</w:t>
-      </w:r>
-      <w:r>
-        <w:rPr>
-          <w:vertAlign w:val="superscript"/>
-        </w:rPr>
-        <w:t xml:space="preserve">1</w:t>
-      </w:r>
-      <w:r>
-        <w:t xml:space="preserve"> </w:t>
-      </w:r>
-      <w:r>
-        <w:t xml:space="preserve">with statements about developing and least developed countries together; the actual results only hold true for the least developed countries, whereas developing countries, notably, showed patterns similar to emerging and developed countries. This reiterates the importance of threshold minima for data quantity (</w:t>
-      </w:r>
-      <w:hyperlink w:anchor="sec-rigour">
-        <w:r>
-          <w:rPr>
-            <w:rStyle w:val="Hyperlink"/>
-          </w:rPr>
-          <w:t xml:space="preserve">Section 4</w:t>
-        </w:r>
-      </w:hyperlink>
-      <w:r>
         <w:t xml:space="preserve">). Nevertheless, in order to claim an effect of the pandemic, the pattern seen during the six-week periods of 2019 and 2020 must be compared against those in other months of the year as well as other pairs of years. Without such contextualization, it is difficult to infer about birders who</w:t>
       </w:r>
       <w:r>
@@ -1466,7 +1535,7 @@
         <w:pStyle w:val="BodyText"/>
       </w:pPr>
       <w:r>
-        <w:t xml:space="preserve">In general, there seems to have been high variability across geographical units in the impact of the pandemic on CS data</w:t>
+        <w:t xml:space="preserve">In general, there seems to have been high variability across geographical units in how the pandemic impacted CS data</w:t>
       </w:r>
       <w:r>
         <w:rPr>
@@ -1475,11 +1544,11 @@
         <w:t xml:space="preserve">3,4</w:t>
       </w:r>
       <w:r>
-        <w:t xml:space="preserve">. As a result, the larger the spatial or temporal scale, the less evidence there seems to be for any strong consistent trend. This is a clear suggestion of multicausal contingency not just in CS data, but more broadly also in the behavioural and sociocultural aspects of biodiversity monitoring today. Importantly, our intent is not to discourage attempts at analysing complex CS data and making large-scale inferences, but rather to caution that such work demands greater care and nuance in its implementation and interpretation.</w:t>
+        <w:t xml:space="preserve">. As a result, the larger the spatial or temporal scale, the less evidence there seems to be for any strong consistent trend. This is a clear suggestion of multicausal contingency not just in CS data, but more broadly also in the behavioural and sociocultural aspects of biodiversity monitoring today. Importantly, our intent is not to discourage attempts at analysing complex CS data and making large-scale inferences, but rather to caution that such work demands greater care and non-reductionist nuance in its implementation and interpretation.</w:t>
       </w:r>
     </w:p>
     <w:bookmarkEnd w:id="41"/>
-    <w:bookmarkStart w:id="91" w:name="references"/>
+    <w:bookmarkStart w:id="97" w:name="references"/>
     <w:p>
       <w:pPr>
         <w:pStyle w:val="Heading1"/>
@@ -1488,7 +1557,7 @@
         <w:t xml:space="preserve">References</w:t>
       </w:r>
     </w:p>
-    <w:bookmarkStart w:id="90" w:name="refs"/>
+    <w:bookmarkStart w:id="96" w:name="refs"/>
     <w:bookmarkStart w:id="43" w:name="ref-roilo2025"/>
     <w:p>
       <w:pPr>
@@ -1891,7 +1960,7 @@
       </w:r>
     </w:p>
     <w:bookmarkEnd w:id="55"/>
-    <w:bookmarkStart w:id="57" w:name="ref-worldometer2023"/>
+    <w:bookmarkStart w:id="57" w:name="ref-bates2021"/>
     <w:p>
       <w:pPr>
         <w:pStyle w:val="Bibliography"/>
@@ -1906,12 +1975,78 @@
         <w:t xml:space="preserve">	</w:t>
       </w:r>
       <w:r>
+        <w:t xml:space="preserve">Bates, A. E.</w:t>
+      </w:r>
+      <w:r>
+        <w:t xml:space="preserve"> </w:t>
+      </w:r>
+      <w:r>
+        <w:rPr>
+          <w:i/>
+          <w:iCs/>
+        </w:rPr>
+        <w:t xml:space="preserve">et al.</w:t>
+      </w:r>
+      <w:r>
+        <w:t xml:space="preserve"> </w:t>
+      </w:r>
+      <w:hyperlink r:id="rId56">
+        <w:r>
+          <w:rPr>
+            <w:rStyle w:val="Hyperlink"/>
+          </w:rPr>
+          <w:t xml:space="preserve">Global COVID-19 lockdown highlights humans as both threats and custodians of the environment</w:t>
+        </w:r>
+      </w:hyperlink>
+      <w:r>
+        <w:t xml:space="preserve">.</w:t>
+      </w:r>
+      <w:r>
+        <w:t xml:space="preserve"> </w:t>
+      </w:r>
+      <w:r>
+        <w:rPr>
+          <w:i/>
+          <w:iCs/>
+        </w:rPr>
+        <w:t xml:space="preserve">Biological Conservation</w:t>
+      </w:r>
+      <w:r>
+        <w:t xml:space="preserve"> </w:t>
+      </w:r>
+      <w:r>
+        <w:rPr>
+          <w:b/>
+          <w:bCs/>
+        </w:rPr>
+        <w:t xml:space="preserve">263</w:t>
+      </w:r>
+      <w:r>
+        <w:t xml:space="preserve">, 109175 (2021).</w:t>
+      </w:r>
+    </w:p>
+    <w:bookmarkEnd w:id="57"/>
+    <w:bookmarkStart w:id="59" w:name="ref-worldometer2023"/>
+    <w:p>
+      <w:pPr>
+        <w:pStyle w:val="Bibliography"/>
+      </w:pPr>
+      <w:r>
+        <w:t xml:space="preserve">9.</w:t>
+      </w:r>
+      <w:r>
+        <w:t xml:space="preserve"> </w:t>
+      </w:r>
+      <w:r>
+        <w:t xml:space="preserve">	</w:t>
+      </w:r>
+      <w:r>
         <w:t xml:space="preserve">Worldometer. COVID Live - Coronavirus Statistics - Worldometer.</w:t>
       </w:r>
       <w:r>
         <w:t xml:space="preserve"> </w:t>
       </w:r>
-      <w:hyperlink r:id="rId56">
+      <w:hyperlink r:id="rId58">
         <w:r>
           <w:rPr>
             <w:rStyle w:val="Hyperlink"/>
@@ -1926,14 +2061,14 @@
         <w:t xml:space="preserve">(2023).</w:t>
       </w:r>
     </w:p>
-    <w:bookmarkEnd w:id="57"/>
-    <w:bookmarkStart w:id="58" w:name="ref-hale2020"/>
+    <w:bookmarkEnd w:id="59"/>
+    <w:bookmarkStart w:id="60" w:name="ref-hale2020"/>
     <w:p>
       <w:pPr>
         <w:pStyle w:val="Bibliography"/>
       </w:pPr>
       <w:r>
-        <w:t xml:space="preserve">9.</w:t>
+        <w:t xml:space="preserve">10.</w:t>
       </w:r>
       <w:r>
         <w:t xml:space="preserve"> </w:t>
@@ -1968,14 +2103,14 @@
         <w:t xml:space="preserve">. (2020).</w:t>
       </w:r>
     </w:p>
-    <w:bookmarkEnd w:id="58"/>
-    <w:bookmarkStart w:id="60" w:name="ref-bbcnews2020"/>
+    <w:bookmarkEnd w:id="60"/>
+    <w:bookmarkStart w:id="62" w:name="ref-bbcnews2020"/>
     <w:p>
       <w:pPr>
         <w:pStyle w:val="Bibliography"/>
       </w:pPr>
       <w:r>
-        <w:t xml:space="preserve">10.</w:t>
+        <w:t xml:space="preserve">11.</w:t>
       </w:r>
       <w:r>
         <w:t xml:space="preserve"> </w:t>
@@ -1989,7 +2124,7 @@
       <w:r>
         <w:t xml:space="preserve"> </w:t>
       </w:r>
-      <w:hyperlink r:id="rId59">
+      <w:hyperlink r:id="rId61">
         <w:r>
           <w:rPr>
             <w:rStyle w:val="Hyperlink"/>
@@ -2041,14 +2176,14 @@
         <w:t xml:space="preserve">(2020).</w:t>
       </w:r>
     </w:p>
-    <w:bookmarkEnd w:id="60"/>
-    <w:bookmarkStart w:id="62" w:name="ref-banerjea2020"/>
+    <w:bookmarkEnd w:id="62"/>
+    <w:bookmarkStart w:id="64" w:name="ref-banerjea2020"/>
     <w:p>
       <w:pPr>
         <w:pStyle w:val="Bibliography"/>
       </w:pPr>
       <w:r>
-        <w:t xml:space="preserve">11.</w:t>
+        <w:t xml:space="preserve">12.</w:t>
       </w:r>
       <w:r>
         <w:t xml:space="preserve"> </w:t>
@@ -2062,7 +2197,7 @@
       <w:r>
         <w:t xml:space="preserve"> </w:t>
       </w:r>
-      <w:hyperlink r:id="rId61">
+      <w:hyperlink r:id="rId63">
         <w:r>
           <w:rPr>
             <w:rStyle w:val="Hyperlink"/>
@@ -2090,14 +2225,14 @@
         <w:t xml:space="preserve">(2020).</w:t>
       </w:r>
     </w:p>
-    <w:bookmarkEnd w:id="62"/>
-    <w:bookmarkStart w:id="64" w:name="ref-johnston2021"/>
+    <w:bookmarkEnd w:id="64"/>
+    <w:bookmarkStart w:id="66" w:name="ref-johnston2021"/>
     <w:p>
       <w:pPr>
         <w:pStyle w:val="Bibliography"/>
       </w:pPr>
       <w:r>
-        <w:t xml:space="preserve">12.</w:t>
+        <w:t xml:space="preserve">13.</w:t>
       </w:r>
       <w:r>
         <w:t xml:space="preserve"> </w:t>
@@ -2121,7 +2256,7 @@
       <w:r>
         <w:t xml:space="preserve"> </w:t>
       </w:r>
-      <w:hyperlink r:id="rId63">
+      <w:hyperlink r:id="rId65">
         <w:r>
           <w:rPr>
             <w:rStyle w:val="Hyperlink"/>
@@ -2156,14 +2291,14 @@
         <w:t xml:space="preserve">, 1265–1277 (2021).</w:t>
       </w:r>
     </w:p>
-    <w:bookmarkEnd w:id="64"/>
-    <w:bookmarkStart w:id="66" w:name="ref-viswanathan2024a"/>
+    <w:bookmarkEnd w:id="66"/>
+    <w:bookmarkStart w:id="68" w:name="ref-viswanathan2024a"/>
     <w:p>
       <w:pPr>
         <w:pStyle w:val="Bibliography"/>
       </w:pPr>
       <w:r>
-        <w:t xml:space="preserve">13.</w:t>
+        <w:t xml:space="preserve">14.</w:t>
       </w:r>
       <w:r>
         <w:t xml:space="preserve"> </w:t>
@@ -2190,7 +2325,7 @@
       <w:r>
         <w:t xml:space="preserve"> </w:t>
       </w:r>
-      <w:hyperlink r:id="rId65">
+      <w:hyperlink r:id="rId67">
         <w:r>
           <w:rPr>
             <w:rStyle w:val="Hyperlink"/>
@@ -2205,14 +2340,14 @@
         <w:t xml:space="preserve">(2024).</w:t>
       </w:r>
     </w:p>
-    <w:bookmarkEnd w:id="66"/>
-    <w:bookmarkStart w:id="67" w:name="ref-isaac2014"/>
+    <w:bookmarkEnd w:id="68"/>
+    <w:bookmarkStart w:id="69" w:name="ref-isaac2014"/>
     <w:p>
       <w:pPr>
         <w:pStyle w:val="Bibliography"/>
       </w:pPr>
       <w:r>
-        <w:t xml:space="preserve">14.</w:t>
+        <w:t xml:space="preserve">15.</w:t>
       </w:r>
       <w:r>
         <w:t xml:space="preserve"> </w:t>
@@ -2247,14 +2382,14 @@
         <w:t xml:space="preserve">, 1052–1060 (2014).</w:t>
       </w:r>
     </w:p>
-    <w:bookmarkEnd w:id="67"/>
-    <w:bookmarkStart w:id="69" w:name="ref-gotelli2004"/>
+    <w:bookmarkEnd w:id="69"/>
+    <w:bookmarkStart w:id="71" w:name="ref-gotelli2004"/>
     <w:p>
       <w:pPr>
         <w:pStyle w:val="Bibliography"/>
       </w:pPr>
       <w:r>
-        <w:t xml:space="preserve">15.</w:t>
+        <w:t xml:space="preserve">16.</w:t>
       </w:r>
       <w:r>
         <w:t xml:space="preserve"> </w:t>
@@ -2268,7 +2403,7 @@
       <w:r>
         <w:t xml:space="preserve"> </w:t>
       </w:r>
-      <w:hyperlink r:id="rId68">
+      <w:hyperlink r:id="rId70">
         <w:r>
           <w:rPr>
             <w:rStyle w:val="Hyperlink"/>
@@ -2282,14 +2417,14 @@
         <w:t xml:space="preserve">. vol. 1 (Sinauer Associates Sunderland, 2004).</w:t>
       </w:r>
     </w:p>
-    <w:bookmarkEnd w:id="69"/>
-    <w:bookmarkStart w:id="71" w:name="ref-wasserstein2016"/>
+    <w:bookmarkEnd w:id="71"/>
+    <w:bookmarkStart w:id="73" w:name="ref-wasserstein2016"/>
     <w:p>
       <w:pPr>
         <w:pStyle w:val="Bibliography"/>
       </w:pPr>
       <w:r>
-        <w:t xml:space="preserve">16.</w:t>
+        <w:t xml:space="preserve">17.</w:t>
       </w:r>
       <w:r>
         <w:t xml:space="preserve"> </w:t>
@@ -2303,7 +2438,7 @@
       <w:r>
         <w:t xml:space="preserve"> </w:t>
       </w:r>
-      <w:hyperlink r:id="rId70">
+      <w:hyperlink r:id="rId72">
         <w:r>
           <w:rPr>
             <w:rStyle w:val="Hyperlink"/>
@@ -2338,14 +2473,14 @@
         <w:t xml:space="preserve">, 129–133 (2016).</w:t>
       </w:r>
     </w:p>
-    <w:bookmarkEnd w:id="71"/>
-    <w:bookmarkStart w:id="73" w:name="ref-mazalla2022"/>
+    <w:bookmarkEnd w:id="73"/>
+    <w:bookmarkStart w:id="75" w:name="ref-mazalla2022"/>
     <w:p>
       <w:pPr>
         <w:pStyle w:val="Bibliography"/>
       </w:pPr>
       <w:r>
-        <w:t xml:space="preserve">17.</w:t>
+        <w:t xml:space="preserve">18.</w:t>
       </w:r>
       <w:r>
         <w:t xml:space="preserve"> </w:t>
@@ -2359,7 +2494,7 @@
       <w:r>
         <w:t xml:space="preserve"> </w:t>
       </w:r>
-      <w:hyperlink r:id="rId72">
+      <w:hyperlink r:id="rId74">
         <w:r>
           <w:rPr>
             <w:rStyle w:val="Hyperlink"/>
@@ -2394,14 +2529,14 @@
         <w:t xml:space="preserve">, e13117 (2022).</w:t>
       </w:r>
     </w:p>
-    <w:bookmarkEnd w:id="73"/>
-    <w:bookmarkStart w:id="75" w:name="ref-barnett2005"/>
+    <w:bookmarkEnd w:id="75"/>
+    <w:bookmarkStart w:id="77" w:name="ref-barnett2005"/>
     <w:p>
       <w:pPr>
         <w:pStyle w:val="Bibliography"/>
       </w:pPr>
       <w:r>
-        <w:t xml:space="preserve">18.</w:t>
+        <w:t xml:space="preserve">19.</w:t>
       </w:r>
       <w:r>
         <w:t xml:space="preserve"> </w:t>
@@ -2415,7 +2550,7 @@
       <w:r>
         <w:t xml:space="preserve"> </w:t>
       </w:r>
-      <w:hyperlink r:id="rId74">
+      <w:hyperlink r:id="rId76">
         <w:r>
           <w:rPr>
             <w:rStyle w:val="Hyperlink"/>
@@ -2450,14 +2585,14 @@
         <w:t xml:space="preserve">, 215–220 (2005).</w:t>
       </w:r>
     </w:p>
-    <w:bookmarkEnd w:id="75"/>
-    <w:bookmarkStart w:id="77" w:name="ref-helwig2024"/>
+    <w:bookmarkEnd w:id="77"/>
+    <w:bookmarkStart w:id="79" w:name="ref-helwig2024"/>
     <w:p>
       <w:pPr>
         <w:pStyle w:val="Bibliography"/>
       </w:pPr>
       <w:r>
-        <w:t xml:space="preserve">19.</w:t>
+        <w:t xml:space="preserve">20.</w:t>
       </w:r>
       <w:r>
         <w:t xml:space="preserve"> </w:t>
@@ -2471,7 +2606,7 @@
       <w:r>
         <w:t xml:space="preserve"> </w:t>
       </w:r>
-      <w:hyperlink r:id="rId76">
+      <w:hyperlink r:id="rId78">
         <w:r>
           <w:rPr>
             <w:rStyle w:val="Hyperlink"/>
@@ -2495,14 +2630,14 @@
         <w:t xml:space="preserve">. (2024).</w:t>
       </w:r>
     </w:p>
-    <w:bookmarkEnd w:id="77"/>
-    <w:bookmarkStart w:id="79" w:name="ref-randler2020"/>
+    <w:bookmarkEnd w:id="79"/>
+    <w:bookmarkStart w:id="81" w:name="ref-randler2020"/>
     <w:p>
       <w:pPr>
         <w:pStyle w:val="Bibliography"/>
       </w:pPr>
       <w:r>
-        <w:t xml:space="preserve">20.</w:t>
+        <w:t xml:space="preserve">21.</w:t>
       </w:r>
       <w:r>
         <w:t xml:space="preserve"> </w:t>
@@ -2516,7 +2651,7 @@
       <w:r>
         <w:t xml:space="preserve"> </w:t>
       </w:r>
-      <w:hyperlink r:id="rId78">
+      <w:hyperlink r:id="rId80">
         <w:r>
           <w:rPr>
             <w:rStyle w:val="Hyperlink"/>
@@ -2551,14 +2686,14 @@
         <w:t xml:space="preserve">, 7310 (2020).</w:t>
       </w:r>
     </w:p>
-    <w:bookmarkEnd w:id="79"/>
-    <w:bookmarkStart w:id="81" w:name="ref-vardi2021"/>
+    <w:bookmarkEnd w:id="81"/>
+    <w:bookmarkStart w:id="83" w:name="ref-vardi2021"/>
     <w:p>
       <w:pPr>
         <w:pStyle w:val="Bibliography"/>
       </w:pPr>
       <w:r>
-        <w:t xml:space="preserve">21.</w:t>
+        <w:t xml:space="preserve">22.</w:t>
       </w:r>
       <w:r>
         <w:t xml:space="preserve"> </w:t>
@@ -2572,7 +2707,7 @@
       <w:r>
         <w:t xml:space="preserve"> </w:t>
       </w:r>
-      <w:hyperlink r:id="rId80">
+      <w:hyperlink r:id="rId82">
         <w:r>
           <w:rPr>
             <w:rStyle w:val="Hyperlink"/>
@@ -2607,14 +2742,14 @@
         <w:t xml:space="preserve">, 108953 (2021).</w:t>
       </w:r>
     </w:p>
-    <w:bookmarkEnd w:id="81"/>
-    <w:bookmarkStart w:id="83" w:name="ref-berger2014"/>
+    <w:bookmarkEnd w:id="83"/>
+    <w:bookmarkStart w:id="85" w:name="ref-berger2014"/>
     <w:p>
       <w:pPr>
         <w:pStyle w:val="Bibliography"/>
       </w:pPr>
       <w:r>
-        <w:t xml:space="preserve">22.</w:t>
+        <w:t xml:space="preserve">23.</w:t>
       </w:r>
       <w:r>
         <w:t xml:space="preserve"> </w:t>
@@ -2641,7 +2776,7 @@
       <w:r>
         <w:t xml:space="preserve">(John Wiley &amp; Sons, Ltd, 2014). doi:</w:t>
       </w:r>
-      <w:hyperlink r:id="rId82">
+      <w:hyperlink r:id="rId84">
         <w:r>
           <w:rPr>
             <w:rStyle w:val="Hyperlink"/>
@@ -2653,14 +2788,14 @@
         <w:t xml:space="preserve">.</w:t>
       </w:r>
     </w:p>
-    <w:bookmarkEnd w:id="83"/>
-    <w:bookmarkStart w:id="85" w:name="ref-bubeliny2011"/>
+    <w:bookmarkEnd w:id="85"/>
+    <w:bookmarkStart w:id="87" w:name="ref-bubeliny2011"/>
     <w:p>
       <w:pPr>
         <w:pStyle w:val="Bibliography"/>
       </w:pPr>
       <w:r>
-        <w:t xml:space="preserve">23.</w:t>
+        <w:t xml:space="preserve">24.</w:t>
       </w:r>
       <w:r>
         <w:t xml:space="preserve"> </w:t>
@@ -2674,7 +2809,7 @@
       <w:r>
         <w:t xml:space="preserve"> </w:t>
       </w:r>
-      <w:hyperlink r:id="rId84">
+      <w:hyperlink r:id="rId86">
         <w:r>
           <w:rPr>
             <w:rStyle w:val="Hyperlink"/>
@@ -2689,14 +2824,14 @@
         <w:t xml:space="preserve">(2011).</w:t>
       </w:r>
     </w:p>
-    <w:bookmarkEnd w:id="85"/>
-    <w:bookmarkStart w:id="87" w:name="ref-kelling2019"/>
+    <w:bookmarkEnd w:id="87"/>
+    <w:bookmarkStart w:id="89" w:name="ref-kelling2019"/>
     <w:p>
       <w:pPr>
         <w:pStyle w:val="Bibliography"/>
       </w:pPr>
       <w:r>
-        <w:t xml:space="preserve">24.</w:t>
+        <w:t xml:space="preserve">25.</w:t>
       </w:r>
       <w:r>
         <w:t xml:space="preserve"> </w:t>
@@ -2720,7 +2855,7 @@
       <w:r>
         <w:t xml:space="preserve"> </w:t>
       </w:r>
-      <w:hyperlink r:id="rId86">
+      <w:hyperlink r:id="rId88">
         <w:r>
           <w:rPr>
             <w:rStyle w:val="Hyperlink"/>
@@ -2755,14 +2890,14 @@
         <w:t xml:space="preserve">, 170–179 (2019).</w:t>
       </w:r>
     </w:p>
-    <w:bookmarkEnd w:id="87"/>
-    <w:bookmarkStart w:id="89" w:name="ref-sullivan2014"/>
+    <w:bookmarkEnd w:id="89"/>
+    <w:bookmarkStart w:id="91" w:name="ref-sullivan2009"/>
     <w:p>
       <w:pPr>
         <w:pStyle w:val="Bibliography"/>
       </w:pPr>
       <w:r>
-        <w:t xml:space="preserve">25.</w:t>
+        <w:t xml:space="preserve">26.</w:t>
       </w:r>
       <w:r>
         <w:t xml:space="preserve"> </w:t>
@@ -2786,7 +2921,73 @@
       <w:r>
         <w:t xml:space="preserve"> </w:t>
       </w:r>
-      <w:hyperlink r:id="rId88">
+      <w:hyperlink r:id="rId90">
+        <w:r>
+          <w:rPr>
+            <w:rStyle w:val="Hyperlink"/>
+          </w:rPr>
+          <w:t xml:space="preserve">eBird: A citizen-based bird observation network in the biological sciences</w:t>
+        </w:r>
+      </w:hyperlink>
+      <w:r>
+        <w:t xml:space="preserve">.</w:t>
+      </w:r>
+      <w:r>
+        <w:t xml:space="preserve"> </w:t>
+      </w:r>
+      <w:r>
+        <w:rPr>
+          <w:i/>
+          <w:iCs/>
+        </w:rPr>
+        <w:t xml:space="preserve">Biological Conservation</w:t>
+      </w:r>
+      <w:r>
+        <w:t xml:space="preserve"> </w:t>
+      </w:r>
+      <w:r>
+        <w:rPr>
+          <w:b/>
+          <w:bCs/>
+        </w:rPr>
+        <w:t xml:space="preserve">142</w:t>
+      </w:r>
+      <w:r>
+        <w:t xml:space="preserve">, 2282–2292 (2009).</w:t>
+      </w:r>
+    </w:p>
+    <w:bookmarkEnd w:id="91"/>
+    <w:bookmarkStart w:id="93" w:name="ref-sullivan2014"/>
+    <w:p>
+      <w:pPr>
+        <w:pStyle w:val="Bibliography"/>
+      </w:pPr>
+      <w:r>
+        <w:t xml:space="preserve">27.</w:t>
+      </w:r>
+      <w:r>
+        <w:t xml:space="preserve"> </w:t>
+      </w:r>
+      <w:r>
+        <w:t xml:space="preserve">	</w:t>
+      </w:r>
+      <w:r>
+        <w:t xml:space="preserve">Sullivan, B. L.</w:t>
+      </w:r>
+      <w:r>
+        <w:t xml:space="preserve"> </w:t>
+      </w:r>
+      <w:r>
+        <w:rPr>
+          <w:i/>
+          <w:iCs/>
+        </w:rPr>
+        <w:t xml:space="preserve">et al.</w:t>
+      </w:r>
+      <w:r>
+        <w:t xml:space="preserve"> </w:t>
+      </w:r>
+      <w:hyperlink r:id="rId92">
         <w:r>
           <w:rPr>
             <w:rStyle w:val="Hyperlink"/>
@@ -2821,15 +3022,60 @@
         <w:t xml:space="preserve">, 31–40 (2014).</w:t>
       </w:r>
     </w:p>
-    <w:bookmarkEnd w:id="89"/>
-    <w:bookmarkEnd w:id="90"/>
+    <w:bookmarkEnd w:id="93"/>
+    <w:bookmarkStart w:id="95" w:name="ref-ingenloff2025"/>
+    <w:p>
+      <w:pPr>
+        <w:pStyle w:val="Bibliography"/>
+      </w:pPr>
+      <w:r>
+        <w:t xml:space="preserve">28.</w:t>
+      </w:r>
+      <w:r>
+        <w:t xml:space="preserve"> </w:t>
+      </w:r>
+      <w:r>
+        <w:t xml:space="preserve">	</w:t>
+      </w:r>
+      <w:r>
+        <w:t xml:space="preserve">Ingenloff, K.</w:t>
+      </w:r>
+      <w:r>
+        <w:t xml:space="preserve"> </w:t>
+      </w:r>
+      <w:r>
+        <w:rPr>
+          <w:i/>
+          <w:iCs/>
+        </w:rPr>
+        <w:t xml:space="preserve">et al.</w:t>
+      </w:r>
+      <w:r>
+        <w:t xml:space="preserve"> </w:t>
+      </w:r>
+      <w:hyperlink r:id="rId94">
+        <w:r>
+          <w:rPr>
+            <w:rStyle w:val="Hyperlink"/>
+            <w:i/>
+            <w:iCs/>
+          </w:rPr>
+          <w:t xml:space="preserve">Guide for publishing biological survey data to GBIF</w:t>
+        </w:r>
+      </w:hyperlink>
+      <w:r>
+        <w:t xml:space="preserve">. (Global Biodiversity Information Facility, 2025).</w:t>
+      </w:r>
+    </w:p>
+    <w:bookmarkEnd w:id="95"/>
+    <w:bookmarkEnd w:id="96"/>
     <w:p>
       <w:r>
         <w:br w:type="page"/>
       </w:r>
     </w:p>
-    <w:bookmarkEnd w:id="91"/>
-    <w:bookmarkStart w:id="92" w:name="author-contributions"/>
+    <w:bookmarkEnd w:id="97"/>
+    <w:bookmarkStart w:id="98" w:name="author-contributions"/>
     <w:p>
       <w:pPr>
         <w:pStyle w:val="Heading1"/>
@@ -2846,8 +3092,8 @@
         <w:t xml:space="preserve">KT and AV conceived the manuscript; KT wrote the first draft; KT and KLV assembled and explored Original Article data and results; KT, AV and KLV designed the analyses; KT performed the analyses; KT, AV and KLV revised and edited the manuscript.</w:t>
       </w:r>
     </w:p>
-    <w:bookmarkEnd w:id="92"/>
-    <w:bookmarkStart w:id="93" w:name="competing-interests"/>
+    <w:bookmarkEnd w:id="98"/>
+    <w:bookmarkStart w:id="99" w:name="competing-interests"/>
     <w:p>
       <w:pPr>
         <w:pStyle w:val="Heading1"/>
@@ -2870,10 +3116,7 @@
         <w:t xml:space="preserve">3</w:t>
       </w:r>
       <w:r>
-        <w:t xml:space="preserve"> </w:t>
-      </w:r>
-      <w:r>
-        <w:t xml:space="preserve">which found results that do not match those in the Original Article. Roilo et al.</w:t>
+        <w:t xml:space="preserve">, the interpretations of which do not match those in the Original Article. Roilo et al.</w:t>
       </w:r>
       <w:r>
         <w:rPr>
@@ -2888,14 +3131,15 @@
         <w:t xml:space="preserve">do not cite or discuss our study, but we maintain that this was not a factor motivating our commentary. Our motivation is borne of a shared research interest and is as detailed in the Introduction and Conclusion.</w:t>
       </w:r>
     </w:p>
-    <w:bookmarkEnd w:id="93"/>
+    <w:bookmarkEnd w:id="99"/>
     <w:sectPr>
+      <w:footerReference r:id="rId9" w:type="default"/>
       <w:footnotePr>
         <w:numFmt w:val="decimal"/>
       </w:footnotePr>
       <w:type w:val="nextPage"/>
       <w:pgSz w:h="15840" w:w="12240"/>
-      <w:pgMar w:bottom="1440" w:footer="0" w:gutter="0" w:header="0" w:left="1440" w:right="1440" w:top="1440"/>
+      <w:pgMar w:bottom="2474" w:footer="1440" w:gutter="0" w:header="0" w:left="1440" w:right="1440" w:top="1440"/>
       <w:lnNumType w:countBy="1" w:distance="283" w:restart="continuous"/>
       <w:pgNumType w:fmt="decimal"/>
       <w:formProt w:val="false"/>
@@ -2908,6 +3152,41 @@
 
 <file path=word/comments.xml><?xml version="1.0" encoding="utf-8"?>
 <w:comments xmlns:w="http://schemas.openxmlformats.org/wordprocessingml/2006/main" xmlns:m="http://schemas.openxmlformats.org/officeDocument/2006/math" xmlns:r="http://schemas.openxmlformats.org/officeDocument/2006/relationships" xmlns:o="urn:schemas-microsoft-com:office:office" xmlns:v="urn:schemas-microsoft-com:vml" xmlns:w10="urn:schemas-microsoft-com:office:word" xmlns:a="http://schemas.openxmlformats.org/drawingml/2006/main" xmlns:pic="http://schemas.openxmlformats.org/drawingml/2006/picture" xmlns:wp="http://schemas.openxmlformats.org/drawingml/2006/wordprocessingDrawing"/>
+</file>
+
+<file path=word/footer1.xml><?xml version="1.0" encoding="utf-8"?>
+<w:ftr xmlns:o="urn:schemas-microsoft-com:office:office" xmlns:r="http://schemas.openxmlformats.org/officeDocument/2006/relationships" xmlns:v="urn:schemas-microsoft-com:vml" xmlns:w="http://schemas.openxmlformats.org/wordprocessingml/2006/main" xmlns:w10="urn:schemas-microsoft-com:office:word" xmlns:wp="http://schemas.openxmlformats.org/drawingml/2006/wordprocessingDrawing" xmlns:wps="http://schemas.microsoft.com/office/word/2010/wordprocessingShape" xmlns:wpg="http://schemas.microsoft.com/office/word/2010/wordprocessingGroup" xmlns:mc="http://schemas.openxmlformats.org/markup-compatibility/2006" xmlns:wp14="http://schemas.microsoft.com/office/word/2010/wordprocessingDrawing" xmlns:w14="http://schemas.microsoft.com/office/word/2010/wordml" xmlns:w15="http://schemas.microsoft.com/office/word/2012/wordml" mc:Ignorable="w14 wp14 w15">
+  <w:p>
+    <w:pPr>
+      <w:pStyle w:val="Footer"/>
+      <w:spacing w:before="0" w:after="200"/>
+      <w:jc w:val="center"/>
+      <w:rPr/>
+    </w:pPr>
+    <w:bookmarkStart w:id="9" w:name="PageNumWizard_FOOTER_Default_Page_Style1"/>
+    <w:r>
+      <w:rPr/>
+      <w:fldChar w:fldCharType="begin"/>
+    </w:r>
+    <w:r>
+      <w:rPr/>
+      <w:instrText xml:space="preserve"> PAGE </w:instrText>
+    </w:r>
+    <w:r>
+      <w:rPr/>
+      <w:fldChar w:fldCharType="separate"/>
+    </w:r>
+    <w:r>
+      <w:rPr/>
+      <w:t>2</w:t>
+    </w:r>
+    <w:r>
+      <w:rPr/>
+      <w:fldChar w:fldCharType="end"/>
+    </w:r>
+    <w:bookmarkEnd w:id="9"/>
+  </w:p>
+</w:ftr>
 </file>
 
 <file path=word/footnotes.xml><?xml version="1.0" encoding="utf-8"?>

</xml_diff>